<commit_message>
[HUMAN] Update STD doc
Change made in STD doc and needed to reupload
</commit_message>
<xml_diff>
--- a/doc/CS673_STD_team3.docx
+++ b/doc/CS673_STD_team3.docx
@@ -2421,7 +2421,7 @@
     </w:p>
     <w:sdt>
       <w:sdtPr>
-        <w:id w:val="663142436"/>
+        <w:id w:val="-1420760486"/>
         <w:docPartObj>
           <w:docPartGallery w:val="Table of Contents"/>
           <w:docPartUnique w:val="1"/>
@@ -5106,6 +5106,38 @@
         <w:ind w:left="720" w:firstLine="0"/>
         <w:rPr/>
       </w:pPr>
+      <w:r>
+        <w:rPr>
+          <w:rtl w:val="0"/>
+        </w:rPr>
+        <w:t xml:space="preserve">       </w:t>
+      </w:r>
+      <w:r>
+        <w:rPr>
+          <w:b w:val="1"/>
+          <w:bCs w:val="1"/>
+          <w:rtl w:val="0"/>
+        </w:rPr>
+        <w:t xml:space="preserve">     Branch:</w:t>
+      </w:r>
+      <w:r>
+        <w:rPr>
+          <w:rtl w:val="0"/>
+        </w:rPr>
+        <w:t xml:space="preserve"> Development [ We are not merging our test automation code in the production (main) branch for now.]</w:t>
+      </w:r>
+    </w:p>
+    <w:p>
+      <w:pPr>
+        <w:ind w:left="720" w:firstLine="0"/>
+        <w:rPr/>
+      </w:pPr>
+      <w:r>
+        <w:rPr>
+          <w:rtl w:val="0"/>
+        </w:rPr>
+        <w:t xml:space="preserve">Location: </w:t>
+      </w:r>
       <w:hyperlink r:id="rId11">
         <w:r>
           <w:rPr>
@@ -9945,6 +9977,7 @@
               <w:rPr>
                 <w:rtl w:val="0"/>
               </w:rPr>
+              <w:t xml:space="preserve">Team 3</w:t>
             </w:r>
           </w:p>
         </w:tc>

</xml_diff>